<commit_message>
checkpoint: clean KM09 coding review wording
</commit_message>
<xml_diff>
--- a/worlds/korvin-merrow/task-setup/platform/task9/current/golden-KM09-v2.docx
+++ b/worlds/korvin-merrow/task-setup/platform/task9/current/golden-KM09-v2.docx
@@ -402,7 +402,7 @@
                 <w:color w:val="232830"/>
                 <w:sz w:val="16"/>
               </w:rPr>
-              <w:t>Inpatient Coding Attestation Addendum</w:t>
+              <w:t>Physician Review of HIM Coding Summary</w:t>
             </w:r>
           </w:p>
         </w:tc>
@@ -410,7 +410,7 @@
     </w:tbl>
     <w:p>
       <w:r>
-        <w:t>INPATIENT CODING ATTESTATION ADDENDUM</w:t>
+        <w:t>PHYSICIAN REVIEW OF HIM PRELIMINARY CODING SUMMARY</w:t>
       </w:r>
     </w:p>
     <w:p>
@@ -475,7 +475,7 @@
     </w:p>
     <w:p>
       <w:r>
-        <w:t>Coding reflects the documented record only. Principal diagnosis is sequenced to the documented suspected urinary-source infection, not to the unconfirmed sepsis framing. Unsupported worksheet items should be routed, if needed, through the documentation integrity query process rather than coded.</w:t>
+        <w:t>This physician coding attestation reflects the documented record only. Principal diagnosis is sequenced to the documented suspected urinary-source infection, not to the unconfirmed sepsis framing. Unsupported worksheet items should be routed, if needed, through the documentation integrity query process rather than coded.</w:t>
       </w:r>
     </w:p>
     <w:p>
@@ -512,7 +512,7 @@
         <w:color w:val="5E6670"/>
         <w:sz w:val="15"/>
       </w:rPr>
-      <w:t>Mercy Vale Regional Medical Center  |  Inpatient Coding Attestation Addendum</w:t>
+      <w:t>Mercy Vale Regional Medical Center  |  Physician Review of HIM Coding Summary</w:t>
     </w:r>
   </w:p>
 </w:ftr>

</xml_diff>